<commit_message>
Add Sessional Final AnswerKey (module-wise) and QB upload Excel
</commit_message>
<xml_diff>
--- a/WBT_Monitor/BOM_5Sets_WBT_Monitor.docx
+++ b/WBT_Monitor/BOM_5Sets_WBT_Monitor.docx
@@ -43,12 +43,6 @@
         <w:gridCol w:w="1802"/>
       </w:tblGrid>
       <w:tr>
-        <w:tblPrEx>
-          <w:tblCellMar>
-            <w:top w:w="0" w:type="dxa"/>
-            <w:bottom w:w="0" w:type="dxa"/>
-          </w:tblCellMar>
-        </w:tblPrEx>
         <w:trPr>
           <w:tblHeader/>
         </w:trPr>
@@ -292,12 +286,6 @@
         </w:tc>
       </w:tr>
       <w:tr>
-        <w:tblPrEx>
-          <w:tblCellMar>
-            <w:top w:w="0" w:type="dxa"/>
-            <w:bottom w:w="0" w:type="dxa"/>
-          </w:tblCellMar>
-        </w:tblPrEx>
         <w:tc>
           <w:tcPr>
             <w:tcW w:w="320" w:type="dxa"/>
@@ -538,12 +526,6 @@
         </w:tc>
       </w:tr>
       <w:tr>
-        <w:tblPrEx>
-          <w:tblCellMar>
-            <w:top w:w="0" w:type="dxa"/>
-            <w:bottom w:w="0" w:type="dxa"/>
-          </w:tblCellMar>
-        </w:tblPrEx>
         <w:tc>
           <w:tcPr>
             <w:tcW w:w="320" w:type="dxa"/>
@@ -589,7 +571,27 @@
                 <w:sz w:val="19"/>
                 <w:szCs w:val="19"/>
               </w:rPr>
-              <w:t>SHT45 Sensor Module</w:t>
+              <w:t>SHT4</w:t>
+            </w:r>
+            <w:r>
+              <w:rPr>
+                <w:b/>
+                <w:bCs/>
+                <w:color w:val="1F3864"/>
+                <w:sz w:val="19"/>
+                <w:szCs w:val="19"/>
+              </w:rPr>
+              <w:t>0</w:t>
+            </w:r>
+            <w:r>
+              <w:rPr>
+                <w:b/>
+                <w:bCs/>
+                <w:color w:val="1F3864"/>
+                <w:sz w:val="19"/>
+                <w:szCs w:val="19"/>
+              </w:rPr>
+              <w:t xml:space="preserve"> Sensor Module</w:t>
             </w:r>
             <w:r>
               <w:rPr>
@@ -615,7 +617,23 @@
                 <w:sz w:val="16"/>
                 <w:szCs w:val="16"/>
               </w:rPr>
-              <w:t xml:space="preserve"> SHT45, I2C breakout</w:t>
+              <w:t xml:space="preserve"> SHT4</w:t>
+            </w:r>
+            <w:r>
+              <w:rPr>
+                <w:color w:val="595959"/>
+                <w:sz w:val="16"/>
+                <w:szCs w:val="16"/>
+              </w:rPr>
+              <w:t>0</w:t>
+            </w:r>
+            <w:r>
+              <w:rPr>
+                <w:color w:val="595959"/>
+                <w:sz w:val="16"/>
+                <w:szCs w:val="16"/>
+              </w:rPr>
+              <w:t>, I2C breakout</w:t>
             </w:r>
           </w:p>
         </w:tc>
@@ -780,12 +798,6 @@
         </w:tc>
       </w:tr>
       <w:tr>
-        <w:tblPrEx>
-          <w:tblCellMar>
-            <w:top w:w="0" w:type="dxa"/>
-            <w:bottom w:w="0" w:type="dxa"/>
-          </w:tblCellMar>
-        </w:tblPrEx>
         <w:tc>
           <w:tcPr>
             <w:tcW w:w="320" w:type="dxa"/>
@@ -991,813 +1003,6 @@
           </w:tcPr>
           <w:p>
             <w:hyperlink r:id="rId8" w:history="1">
-              <w:r>
-                <w:rPr>
-                  <w:rStyle w:val="Hyperlink"/>
-                  <w:color w:val="2E75B6"/>
-                  <w:sz w:val="18"/>
-                  <w:szCs w:val="18"/>
-                </w:rPr>
-                <w:t>robu.</w:t>
-              </w:r>
-              <w:r>
-                <w:rPr>
-                  <w:rStyle w:val="Hyperlink"/>
-                  <w:color w:val="2E75B6"/>
-                  <w:sz w:val="18"/>
-                  <w:szCs w:val="18"/>
-                </w:rPr>
-                <w:t>i</w:t>
-              </w:r>
-              <w:r>
-                <w:rPr>
-                  <w:rStyle w:val="Hyperlink"/>
-                  <w:color w:val="2E75B6"/>
-                  <w:sz w:val="18"/>
-                  <w:szCs w:val="18"/>
-                </w:rPr>
-                <w:t>n</w:t>
-              </w:r>
-            </w:hyperlink>
-            <w:r>
-              <w:rPr>
-                <w:color w:val="595959"/>
-                <w:sz w:val="16"/>
-                <w:szCs w:val="16"/>
-              </w:rPr>
-              <w:t xml:space="preserve">  |  </w:t>
-            </w:r>
-            <w:hyperlink r:id="rId9" w:history="1">
-              <w:proofErr w:type="spellStart"/>
-              <w:r>
-                <w:rPr>
-                  <w:rStyle w:val="Hyperlink"/>
-                  <w:color w:val="2E75B6"/>
-                  <w:sz w:val="18"/>
-                  <w:szCs w:val="18"/>
-                </w:rPr>
-                <w:t>Robocraze</w:t>
-              </w:r>
-              <w:proofErr w:type="spellEnd"/>
-            </w:hyperlink>
-          </w:p>
-        </w:tc>
-      </w:tr>
-      <w:tr>
-        <w:tblPrEx>
-          <w:tblCellMar>
-            <w:top w:w="0" w:type="dxa"/>
-            <w:bottom w:w="0" w:type="dxa"/>
-          </w:tblCellMar>
-        </w:tblPrEx>
-        <w:tc>
-          <w:tcPr>
-            <w:tcW w:w="320" w:type="dxa"/>
-            <w:shd w:val="clear" w:color="auto" w:fill="FFFFFF"/>
-            <w:tcMar>
-              <w:top w:w="55" w:type="dxa"/>
-              <w:left w:w="80" w:type="dxa"/>
-              <w:bottom w:w="55" w:type="dxa"/>
-              <w:right w:w="80" w:type="dxa"/>
-            </w:tcMar>
-          </w:tcPr>
-          <w:p>
-            <w:pPr>
-              <w:jc w:val="center"/>
-            </w:pPr>
-            <w:r>
-              <w:rPr>
-                <w:color w:val="595959"/>
-                <w:sz w:val="18"/>
-                <w:szCs w:val="18"/>
-              </w:rPr>
-              <w:t>4</w:t>
-            </w:r>
-          </w:p>
-        </w:tc>
-        <w:tc>
-          <w:tcPr>
-            <w:tcW w:w="1800" w:type="dxa"/>
-            <w:shd w:val="clear" w:color="auto" w:fill="FFFFFF"/>
-            <w:tcMar>
-              <w:top w:w="55" w:type="dxa"/>
-              <w:left w:w="80" w:type="dxa"/>
-              <w:bottom w:w="55" w:type="dxa"/>
-              <w:right w:w="80" w:type="dxa"/>
-            </w:tcMar>
-          </w:tcPr>
-          <w:p>
-            <w:r>
-              <w:rPr>
-                <w:b/>
-                <w:bCs/>
-                <w:color w:val="1F3864"/>
-                <w:sz w:val="19"/>
-                <w:szCs w:val="19"/>
-              </w:rPr>
-              <w:t>Active Piezo Buzzer</w:t>
-            </w:r>
-            <w:r>
-              <w:rPr>
-                <w:color w:val="595959"/>
-                <w:sz w:val="16"/>
-                <w:szCs w:val="16"/>
-              </w:rPr>
-              <w:t xml:space="preserve"> 3.3V–5V, self-oscillating</w:t>
-            </w:r>
-          </w:p>
-        </w:tc>
-        <w:tc>
-          <w:tcPr>
-            <w:tcW w:w="460" w:type="dxa"/>
-            <w:shd w:val="clear" w:color="auto" w:fill="FFFFFF"/>
-            <w:tcMar>
-              <w:top w:w="55" w:type="dxa"/>
-              <w:left w:w="80" w:type="dxa"/>
-              <w:bottom w:w="55" w:type="dxa"/>
-              <w:right w:w="80" w:type="dxa"/>
-            </w:tcMar>
-          </w:tcPr>
-          <w:p>
-            <w:pPr>
-              <w:jc w:val="center"/>
-            </w:pPr>
-            <w:r>
-              <w:rPr>
-                <w:color w:val="1F3864"/>
-                <w:sz w:val="18"/>
-                <w:szCs w:val="18"/>
-              </w:rPr>
-              <w:t>pcs</w:t>
-            </w:r>
-          </w:p>
-        </w:tc>
-        <w:tc>
-          <w:tcPr>
-            <w:tcW w:w="480" w:type="dxa"/>
-            <w:shd w:val="clear" w:color="auto" w:fill="FFFFFF"/>
-            <w:tcMar>
-              <w:top w:w="55" w:type="dxa"/>
-              <w:left w:w="80" w:type="dxa"/>
-              <w:bottom w:w="55" w:type="dxa"/>
-              <w:right w:w="80" w:type="dxa"/>
-            </w:tcMar>
-          </w:tcPr>
-          <w:p>
-            <w:pPr>
-              <w:jc w:val="center"/>
-            </w:pPr>
-            <w:r>
-              <w:rPr>
-                <w:color w:val="1F3864"/>
-                <w:sz w:val="19"/>
-                <w:szCs w:val="19"/>
-              </w:rPr>
-              <w:t>1</w:t>
-            </w:r>
-          </w:p>
-        </w:tc>
-        <w:tc>
-          <w:tcPr>
-            <w:tcW w:w="560" w:type="dxa"/>
-            <w:shd w:val="clear" w:color="auto" w:fill="FFFFFF"/>
-            <w:tcMar>
-              <w:top w:w="55" w:type="dxa"/>
-              <w:left w:w="80" w:type="dxa"/>
-              <w:bottom w:w="55" w:type="dxa"/>
-              <w:right w:w="80" w:type="dxa"/>
-            </w:tcMar>
-          </w:tcPr>
-          <w:p>
-            <w:pPr>
-              <w:jc w:val="center"/>
-            </w:pPr>
-            <w:r>
-              <w:rPr>
-                <w:b/>
-                <w:bCs/>
-                <w:color w:val="2E75B6"/>
-                <w:sz w:val="19"/>
-                <w:szCs w:val="19"/>
-              </w:rPr>
-              <w:t>5</w:t>
-            </w:r>
-          </w:p>
-        </w:tc>
-        <w:tc>
-          <w:tcPr>
-            <w:tcW w:w="700" w:type="dxa"/>
-            <w:shd w:val="clear" w:color="auto" w:fill="FFFFFF"/>
-            <w:tcMar>
-              <w:top w:w="55" w:type="dxa"/>
-              <w:left w:w="80" w:type="dxa"/>
-              <w:bottom w:w="55" w:type="dxa"/>
-              <w:right w:w="80" w:type="dxa"/>
-            </w:tcMar>
-          </w:tcPr>
-          <w:p>
-            <w:pPr>
-              <w:jc w:val="right"/>
-            </w:pPr>
-            <w:r>
-              <w:rPr>
-                <w:color w:val="1F3864"/>
-                <w:sz w:val="18"/>
-                <w:szCs w:val="18"/>
-              </w:rPr>
-              <w:t>₹</w:t>
-            </w:r>
-            <w:r>
-              <w:rPr>
-                <w:color w:val="1F3864"/>
-                <w:sz w:val="18"/>
-                <w:szCs w:val="18"/>
-              </w:rPr>
-              <w:t>20</w:t>
-            </w:r>
-          </w:p>
-        </w:tc>
-        <w:tc>
-          <w:tcPr>
-            <w:tcW w:w="700" w:type="dxa"/>
-            <w:shd w:val="clear" w:color="auto" w:fill="FFFFFF"/>
-            <w:tcMar>
-              <w:top w:w="55" w:type="dxa"/>
-              <w:left w:w="80" w:type="dxa"/>
-              <w:bottom w:w="55" w:type="dxa"/>
-              <w:right w:w="80" w:type="dxa"/>
-            </w:tcMar>
-          </w:tcPr>
-          <w:p>
-            <w:pPr>
-              <w:jc w:val="right"/>
-            </w:pPr>
-            <w:r>
-              <w:rPr>
-                <w:color w:val="1F3864"/>
-                <w:sz w:val="18"/>
-                <w:szCs w:val="18"/>
-              </w:rPr>
-              <w:t>₹150</w:t>
-            </w:r>
-          </w:p>
-        </w:tc>
-        <w:tc>
-          <w:tcPr>
-            <w:tcW w:w="2480" w:type="dxa"/>
-            <w:shd w:val="clear" w:color="auto" w:fill="FFFFFF"/>
-            <w:tcMar>
-              <w:top w:w="55" w:type="dxa"/>
-              <w:left w:w="80" w:type="dxa"/>
-              <w:bottom w:w="55" w:type="dxa"/>
-              <w:right w:w="80" w:type="dxa"/>
-            </w:tcMar>
-          </w:tcPr>
-          <w:p>
-            <w:hyperlink r:id="rId10" w:history="1">
-              <w:r>
-                <w:rPr>
-                  <w:rStyle w:val="Hyperlink"/>
-                  <w:color w:val="2E75B6"/>
-                  <w:sz w:val="18"/>
-                  <w:szCs w:val="18"/>
-                </w:rPr>
-                <w:t>robu</w:t>
-              </w:r>
-              <w:r>
-                <w:rPr>
-                  <w:rStyle w:val="Hyperlink"/>
-                  <w:color w:val="2E75B6"/>
-                  <w:sz w:val="18"/>
-                  <w:szCs w:val="18"/>
-                </w:rPr>
-                <w:t>.</w:t>
-              </w:r>
-              <w:r>
-                <w:rPr>
-                  <w:rStyle w:val="Hyperlink"/>
-                  <w:color w:val="2E75B6"/>
-                  <w:sz w:val="18"/>
-                  <w:szCs w:val="18"/>
-                </w:rPr>
-                <w:t>in</w:t>
-              </w:r>
-            </w:hyperlink>
-            <w:r>
-              <w:rPr>
-                <w:color w:val="595959"/>
-                <w:sz w:val="16"/>
-                <w:szCs w:val="16"/>
-              </w:rPr>
-              <w:t xml:space="preserve">  |  </w:t>
-            </w:r>
-            <w:hyperlink r:id="rId11" w:history="1">
-              <w:proofErr w:type="spellStart"/>
-              <w:r>
-                <w:rPr>
-                  <w:rStyle w:val="Hyperlink"/>
-                  <w:color w:val="2E75B6"/>
-                  <w:sz w:val="18"/>
-                  <w:szCs w:val="18"/>
-                </w:rPr>
-                <w:t>Robocraze</w:t>
-              </w:r>
-              <w:proofErr w:type="spellEnd"/>
-            </w:hyperlink>
-          </w:p>
-        </w:tc>
-      </w:tr>
-      <w:tr>
-        <w:tblPrEx>
-          <w:tblCellMar>
-            <w:top w:w="0" w:type="dxa"/>
-            <w:bottom w:w="0" w:type="dxa"/>
-          </w:tblCellMar>
-        </w:tblPrEx>
-        <w:tc>
-          <w:tcPr>
-            <w:tcW w:w="320" w:type="dxa"/>
-            <w:shd w:val="clear" w:color="auto" w:fill="EEF3FA"/>
-            <w:tcMar>
-              <w:top w:w="55" w:type="dxa"/>
-              <w:left w:w="80" w:type="dxa"/>
-              <w:bottom w:w="55" w:type="dxa"/>
-              <w:right w:w="80" w:type="dxa"/>
-            </w:tcMar>
-          </w:tcPr>
-          <w:p>
-            <w:pPr>
-              <w:jc w:val="center"/>
-            </w:pPr>
-            <w:r>
-              <w:rPr>
-                <w:color w:val="595959"/>
-                <w:sz w:val="18"/>
-                <w:szCs w:val="18"/>
-              </w:rPr>
-              <w:t>5</w:t>
-            </w:r>
-          </w:p>
-        </w:tc>
-        <w:tc>
-          <w:tcPr>
-            <w:tcW w:w="1800" w:type="dxa"/>
-            <w:shd w:val="clear" w:color="auto" w:fill="EEF3FA"/>
-            <w:tcMar>
-              <w:top w:w="55" w:type="dxa"/>
-              <w:left w:w="80" w:type="dxa"/>
-              <w:bottom w:w="55" w:type="dxa"/>
-              <w:right w:w="80" w:type="dxa"/>
-            </w:tcMar>
-          </w:tcPr>
-          <w:p>
-            <w:r>
-              <w:rPr>
-                <w:b/>
-                <w:bCs/>
-                <w:color w:val="1F3864"/>
-                <w:sz w:val="19"/>
-                <w:szCs w:val="19"/>
-              </w:rPr>
-              <w:t>RGB LED</w:t>
-            </w:r>
-            <w:r>
-              <w:rPr>
-                <w:color w:val="595959"/>
-                <w:sz w:val="16"/>
-                <w:szCs w:val="16"/>
-              </w:rPr>
-              <w:t xml:space="preserve"> 5mm common cathode</w:t>
-            </w:r>
-          </w:p>
-        </w:tc>
-        <w:tc>
-          <w:tcPr>
-            <w:tcW w:w="460" w:type="dxa"/>
-            <w:shd w:val="clear" w:color="auto" w:fill="EEF3FA"/>
-            <w:tcMar>
-              <w:top w:w="55" w:type="dxa"/>
-              <w:left w:w="80" w:type="dxa"/>
-              <w:bottom w:w="55" w:type="dxa"/>
-              <w:right w:w="80" w:type="dxa"/>
-            </w:tcMar>
-          </w:tcPr>
-          <w:p>
-            <w:pPr>
-              <w:jc w:val="center"/>
-            </w:pPr>
-            <w:r>
-              <w:rPr>
-                <w:color w:val="1F3864"/>
-                <w:sz w:val="18"/>
-                <w:szCs w:val="18"/>
-              </w:rPr>
-              <w:t>pcs</w:t>
-            </w:r>
-          </w:p>
-        </w:tc>
-        <w:tc>
-          <w:tcPr>
-            <w:tcW w:w="480" w:type="dxa"/>
-            <w:shd w:val="clear" w:color="auto" w:fill="EEF3FA"/>
-            <w:tcMar>
-              <w:top w:w="55" w:type="dxa"/>
-              <w:left w:w="80" w:type="dxa"/>
-              <w:bottom w:w="55" w:type="dxa"/>
-              <w:right w:w="80" w:type="dxa"/>
-            </w:tcMar>
-          </w:tcPr>
-          <w:p>
-            <w:pPr>
-              <w:jc w:val="center"/>
-            </w:pPr>
-            <w:r>
-              <w:rPr>
-                <w:color w:val="1F3864"/>
-                <w:sz w:val="19"/>
-                <w:szCs w:val="19"/>
-              </w:rPr>
-              <w:t>1</w:t>
-            </w:r>
-          </w:p>
-        </w:tc>
-        <w:tc>
-          <w:tcPr>
-            <w:tcW w:w="560" w:type="dxa"/>
-            <w:shd w:val="clear" w:color="auto" w:fill="EEF3FA"/>
-            <w:tcMar>
-              <w:top w:w="55" w:type="dxa"/>
-              <w:left w:w="80" w:type="dxa"/>
-              <w:bottom w:w="55" w:type="dxa"/>
-              <w:right w:w="80" w:type="dxa"/>
-            </w:tcMar>
-          </w:tcPr>
-          <w:p>
-            <w:pPr>
-              <w:jc w:val="center"/>
-            </w:pPr>
-            <w:r>
-              <w:rPr>
-                <w:b/>
-                <w:bCs/>
-                <w:color w:val="2E75B6"/>
-                <w:sz w:val="19"/>
-                <w:szCs w:val="19"/>
-              </w:rPr>
-              <w:t>5</w:t>
-            </w:r>
-          </w:p>
-        </w:tc>
-        <w:tc>
-          <w:tcPr>
-            <w:tcW w:w="700" w:type="dxa"/>
-            <w:shd w:val="clear" w:color="auto" w:fill="EEF3FA"/>
-            <w:tcMar>
-              <w:top w:w="55" w:type="dxa"/>
-              <w:left w:w="80" w:type="dxa"/>
-              <w:bottom w:w="55" w:type="dxa"/>
-              <w:right w:w="80" w:type="dxa"/>
-            </w:tcMar>
-          </w:tcPr>
-          <w:p>
-            <w:pPr>
-              <w:jc w:val="right"/>
-            </w:pPr>
-            <w:r>
-              <w:rPr>
-                <w:color w:val="1F3864"/>
-                <w:sz w:val="18"/>
-                <w:szCs w:val="18"/>
-              </w:rPr>
-              <w:t>₹10</w:t>
-            </w:r>
-          </w:p>
-        </w:tc>
-        <w:tc>
-          <w:tcPr>
-            <w:tcW w:w="700" w:type="dxa"/>
-            <w:shd w:val="clear" w:color="auto" w:fill="EEF3FA"/>
-            <w:tcMar>
-              <w:top w:w="55" w:type="dxa"/>
-              <w:left w:w="80" w:type="dxa"/>
-              <w:bottom w:w="55" w:type="dxa"/>
-              <w:right w:w="80" w:type="dxa"/>
-            </w:tcMar>
-          </w:tcPr>
-          <w:p>
-            <w:pPr>
-              <w:jc w:val="right"/>
-            </w:pPr>
-            <w:r>
-              <w:rPr>
-                <w:color w:val="1F3864"/>
-                <w:sz w:val="18"/>
-                <w:szCs w:val="18"/>
-              </w:rPr>
-              <w:t>₹50</w:t>
-            </w:r>
-          </w:p>
-        </w:tc>
-        <w:tc>
-          <w:tcPr>
-            <w:tcW w:w="2480" w:type="dxa"/>
-            <w:shd w:val="clear" w:color="auto" w:fill="EEF3FA"/>
-            <w:tcMar>
-              <w:top w:w="55" w:type="dxa"/>
-              <w:left w:w="80" w:type="dxa"/>
-              <w:bottom w:w="55" w:type="dxa"/>
-              <w:right w:w="80" w:type="dxa"/>
-            </w:tcMar>
-          </w:tcPr>
-          <w:p>
-            <w:hyperlink r:id="rId12" w:history="1">
-              <w:r>
-                <w:rPr>
-                  <w:rStyle w:val="Hyperlink"/>
-                  <w:color w:val="2E75B6"/>
-                  <w:sz w:val="18"/>
-                  <w:szCs w:val="18"/>
-                </w:rPr>
-                <w:t>robu</w:t>
-              </w:r>
-              <w:r>
-                <w:rPr>
-                  <w:rStyle w:val="Hyperlink"/>
-                  <w:color w:val="2E75B6"/>
-                  <w:sz w:val="18"/>
-                  <w:szCs w:val="18"/>
-                </w:rPr>
-                <w:t>.</w:t>
-              </w:r>
-              <w:r>
-                <w:rPr>
-                  <w:rStyle w:val="Hyperlink"/>
-                  <w:color w:val="2E75B6"/>
-                  <w:sz w:val="18"/>
-                  <w:szCs w:val="18"/>
-                </w:rPr>
-                <w:t>in</w:t>
-              </w:r>
-            </w:hyperlink>
-            <w:r>
-              <w:rPr>
-                <w:color w:val="595959"/>
-                <w:sz w:val="16"/>
-                <w:szCs w:val="16"/>
-              </w:rPr>
-              <w:t xml:space="preserve">  |  </w:t>
-            </w:r>
-            <w:hyperlink r:id="rId13" w:history="1">
-              <w:proofErr w:type="spellStart"/>
-              <w:r>
-                <w:rPr>
-                  <w:rStyle w:val="Hyperlink"/>
-                  <w:color w:val="2E75B6"/>
-                  <w:sz w:val="18"/>
-                  <w:szCs w:val="18"/>
-                </w:rPr>
-                <w:t>Robocraze</w:t>
-              </w:r>
-              <w:proofErr w:type="spellEnd"/>
-            </w:hyperlink>
-          </w:p>
-        </w:tc>
-      </w:tr>
-      <w:tr>
-        <w:tblPrEx>
-          <w:tblCellMar>
-            <w:top w:w="0" w:type="dxa"/>
-            <w:bottom w:w="0" w:type="dxa"/>
-          </w:tblCellMar>
-        </w:tblPrEx>
-        <w:tc>
-          <w:tcPr>
-            <w:tcW w:w="320" w:type="dxa"/>
-            <w:shd w:val="clear" w:color="auto" w:fill="FFFFFF"/>
-            <w:tcMar>
-              <w:top w:w="55" w:type="dxa"/>
-              <w:left w:w="80" w:type="dxa"/>
-              <w:bottom w:w="55" w:type="dxa"/>
-              <w:right w:w="80" w:type="dxa"/>
-            </w:tcMar>
-          </w:tcPr>
-          <w:p>
-            <w:pPr>
-              <w:jc w:val="center"/>
-            </w:pPr>
-            <w:r>
-              <w:rPr>
-                <w:color w:val="595959"/>
-                <w:sz w:val="18"/>
-                <w:szCs w:val="18"/>
-              </w:rPr>
-              <w:t>6</w:t>
-            </w:r>
-          </w:p>
-        </w:tc>
-        <w:tc>
-          <w:tcPr>
-            <w:tcW w:w="1800" w:type="dxa"/>
-            <w:shd w:val="clear" w:color="auto" w:fill="FFFFFF"/>
-            <w:tcMar>
-              <w:top w:w="55" w:type="dxa"/>
-              <w:left w:w="80" w:type="dxa"/>
-              <w:bottom w:w="55" w:type="dxa"/>
-              <w:right w:w="80" w:type="dxa"/>
-            </w:tcMar>
-          </w:tcPr>
-          <w:p>
-            <w:pPr>
-              <w:rPr>
-                <w:lang w:val="it-IT"/>
-              </w:rPr>
-            </w:pPr>
-            <w:r>
-              <w:rPr>
-                <w:b/>
-                <w:bCs/>
-                <w:color w:val="1F3864"/>
-                <w:sz w:val="19"/>
-                <w:szCs w:val="19"/>
-                <w:lang w:val="it-IT"/>
-              </w:rPr>
-              <w:t xml:space="preserve">18650 </w:t>
-            </w:r>
-            <w:proofErr w:type="spellStart"/>
-            <w:r>
-              <w:rPr>
-                <w:b/>
-                <w:bCs/>
-                <w:color w:val="1F3864"/>
-                <w:sz w:val="19"/>
-                <w:szCs w:val="19"/>
-                <w:lang w:val="it-IT"/>
-              </w:rPr>
-              <w:t>Li-ion</w:t>
-            </w:r>
-            <w:proofErr w:type="spellEnd"/>
-            <w:r>
-              <w:rPr>
-                <w:b/>
-                <w:bCs/>
-                <w:color w:val="1F3864"/>
-                <w:sz w:val="19"/>
-                <w:szCs w:val="19"/>
-                <w:lang w:val="it-IT"/>
-              </w:rPr>
-              <w:t xml:space="preserve"> Cell</w:t>
-            </w:r>
-            <w:r>
-              <w:rPr>
-                <w:color w:val="595959"/>
-                <w:sz w:val="16"/>
-                <w:szCs w:val="16"/>
-                <w:lang w:val="it-IT"/>
-              </w:rPr>
-              <w:t xml:space="preserve"> 3.7V 3000mAh Samsung/Sony</w:t>
-            </w:r>
-          </w:p>
-        </w:tc>
-        <w:tc>
-          <w:tcPr>
-            <w:tcW w:w="460" w:type="dxa"/>
-            <w:shd w:val="clear" w:color="auto" w:fill="FFFFFF"/>
-            <w:tcMar>
-              <w:top w:w="55" w:type="dxa"/>
-              <w:left w:w="80" w:type="dxa"/>
-              <w:bottom w:w="55" w:type="dxa"/>
-              <w:right w:w="80" w:type="dxa"/>
-            </w:tcMar>
-          </w:tcPr>
-          <w:p>
-            <w:pPr>
-              <w:jc w:val="center"/>
-            </w:pPr>
-            <w:r>
-              <w:rPr>
-                <w:color w:val="1F3864"/>
-                <w:sz w:val="18"/>
-                <w:szCs w:val="18"/>
-              </w:rPr>
-              <w:t>pcs</w:t>
-            </w:r>
-          </w:p>
-        </w:tc>
-        <w:tc>
-          <w:tcPr>
-            <w:tcW w:w="480" w:type="dxa"/>
-            <w:shd w:val="clear" w:color="auto" w:fill="FFFFFF"/>
-            <w:tcMar>
-              <w:top w:w="55" w:type="dxa"/>
-              <w:left w:w="80" w:type="dxa"/>
-              <w:bottom w:w="55" w:type="dxa"/>
-              <w:right w:w="80" w:type="dxa"/>
-            </w:tcMar>
-          </w:tcPr>
-          <w:p>
-            <w:pPr>
-              <w:jc w:val="center"/>
-            </w:pPr>
-            <w:r>
-              <w:rPr>
-                <w:color w:val="1F3864"/>
-                <w:sz w:val="19"/>
-                <w:szCs w:val="19"/>
-              </w:rPr>
-              <w:t>2</w:t>
-            </w:r>
-          </w:p>
-        </w:tc>
-        <w:tc>
-          <w:tcPr>
-            <w:tcW w:w="560" w:type="dxa"/>
-            <w:shd w:val="clear" w:color="auto" w:fill="FFFFFF"/>
-            <w:tcMar>
-              <w:top w:w="55" w:type="dxa"/>
-              <w:left w:w="80" w:type="dxa"/>
-              <w:bottom w:w="55" w:type="dxa"/>
-              <w:right w:w="80" w:type="dxa"/>
-            </w:tcMar>
-          </w:tcPr>
-          <w:p>
-            <w:pPr>
-              <w:jc w:val="center"/>
-            </w:pPr>
-            <w:r>
-              <w:rPr>
-                <w:b/>
-                <w:bCs/>
-                <w:color w:val="2E75B6"/>
-                <w:sz w:val="19"/>
-                <w:szCs w:val="19"/>
-              </w:rPr>
-              <w:t>10</w:t>
-            </w:r>
-          </w:p>
-        </w:tc>
-        <w:tc>
-          <w:tcPr>
-            <w:tcW w:w="700" w:type="dxa"/>
-            <w:shd w:val="clear" w:color="auto" w:fill="FFFFFF"/>
-            <w:tcMar>
-              <w:top w:w="55" w:type="dxa"/>
-              <w:left w:w="80" w:type="dxa"/>
-              <w:bottom w:w="55" w:type="dxa"/>
-              <w:right w:w="80" w:type="dxa"/>
-            </w:tcMar>
-          </w:tcPr>
-          <w:p>
-            <w:pPr>
-              <w:jc w:val="right"/>
-            </w:pPr>
-            <w:r>
-              <w:rPr>
-                <w:color w:val="1F3864"/>
-                <w:sz w:val="18"/>
-                <w:szCs w:val="18"/>
-              </w:rPr>
-              <w:t>₹150</w:t>
-            </w:r>
-          </w:p>
-        </w:tc>
-        <w:tc>
-          <w:tcPr>
-            <w:tcW w:w="700" w:type="dxa"/>
-            <w:shd w:val="clear" w:color="auto" w:fill="FFFFFF"/>
-            <w:tcMar>
-              <w:top w:w="55" w:type="dxa"/>
-              <w:left w:w="80" w:type="dxa"/>
-              <w:bottom w:w="55" w:type="dxa"/>
-              <w:right w:w="80" w:type="dxa"/>
-            </w:tcMar>
-          </w:tcPr>
-          <w:p>
-            <w:pPr>
-              <w:jc w:val="right"/>
-            </w:pPr>
-            <w:r>
-              <w:rPr>
-                <w:color w:val="1F3864"/>
-                <w:sz w:val="18"/>
-                <w:szCs w:val="18"/>
-              </w:rPr>
-              <w:t>₹1,500</w:t>
-            </w:r>
-          </w:p>
-        </w:tc>
-        <w:tc>
-          <w:tcPr>
-            <w:tcW w:w="2480" w:type="dxa"/>
-            <w:shd w:val="clear" w:color="auto" w:fill="FFFFFF"/>
-            <w:tcMar>
-              <w:top w:w="55" w:type="dxa"/>
-              <w:left w:w="80" w:type="dxa"/>
-              <w:bottom w:w="55" w:type="dxa"/>
-              <w:right w:w="80" w:type="dxa"/>
-            </w:tcMar>
-          </w:tcPr>
-          <w:p>
-            <w:hyperlink r:id="rId14" w:history="1">
               <w:r>
                 <w:rPr>
                   <w:rStyle w:val="Hyperlink"/>
@@ -1834,6 +1039,741 @@
               </w:rPr>
               <w:t xml:space="preserve">  |  </w:t>
             </w:r>
+            <w:hyperlink r:id="rId9" w:history="1">
+              <w:proofErr w:type="spellStart"/>
+              <w:r>
+                <w:rPr>
+                  <w:rStyle w:val="Hyperlink"/>
+                  <w:color w:val="2E75B6"/>
+                  <w:sz w:val="18"/>
+                  <w:szCs w:val="18"/>
+                </w:rPr>
+                <w:t>Robocraze</w:t>
+              </w:r>
+              <w:proofErr w:type="spellEnd"/>
+            </w:hyperlink>
+          </w:p>
+        </w:tc>
+      </w:tr>
+      <w:tr>
+        <w:tc>
+          <w:tcPr>
+            <w:tcW w:w="320" w:type="dxa"/>
+            <w:shd w:val="clear" w:color="auto" w:fill="FFFFFF"/>
+            <w:tcMar>
+              <w:top w:w="55" w:type="dxa"/>
+              <w:left w:w="80" w:type="dxa"/>
+              <w:bottom w:w="55" w:type="dxa"/>
+              <w:right w:w="80" w:type="dxa"/>
+            </w:tcMar>
+          </w:tcPr>
+          <w:p>
+            <w:pPr>
+              <w:jc w:val="center"/>
+            </w:pPr>
+            <w:r>
+              <w:rPr>
+                <w:color w:val="595959"/>
+                <w:sz w:val="18"/>
+                <w:szCs w:val="18"/>
+              </w:rPr>
+              <w:t>4</w:t>
+            </w:r>
+          </w:p>
+        </w:tc>
+        <w:tc>
+          <w:tcPr>
+            <w:tcW w:w="1800" w:type="dxa"/>
+            <w:shd w:val="clear" w:color="auto" w:fill="FFFFFF"/>
+            <w:tcMar>
+              <w:top w:w="55" w:type="dxa"/>
+              <w:left w:w="80" w:type="dxa"/>
+              <w:bottom w:w="55" w:type="dxa"/>
+              <w:right w:w="80" w:type="dxa"/>
+            </w:tcMar>
+          </w:tcPr>
+          <w:p>
+            <w:r>
+              <w:rPr>
+                <w:b/>
+                <w:bCs/>
+                <w:color w:val="1F3864"/>
+                <w:sz w:val="19"/>
+                <w:szCs w:val="19"/>
+              </w:rPr>
+              <w:t>Active Piezo Buzzer</w:t>
+            </w:r>
+            <w:r>
+              <w:rPr>
+                <w:color w:val="595959"/>
+                <w:sz w:val="16"/>
+                <w:szCs w:val="16"/>
+              </w:rPr>
+              <w:t xml:space="preserve"> 3.3V–5V, self-oscillating</w:t>
+            </w:r>
+          </w:p>
+        </w:tc>
+        <w:tc>
+          <w:tcPr>
+            <w:tcW w:w="460" w:type="dxa"/>
+            <w:shd w:val="clear" w:color="auto" w:fill="FFFFFF"/>
+            <w:tcMar>
+              <w:top w:w="55" w:type="dxa"/>
+              <w:left w:w="80" w:type="dxa"/>
+              <w:bottom w:w="55" w:type="dxa"/>
+              <w:right w:w="80" w:type="dxa"/>
+            </w:tcMar>
+          </w:tcPr>
+          <w:p>
+            <w:pPr>
+              <w:jc w:val="center"/>
+            </w:pPr>
+            <w:r>
+              <w:rPr>
+                <w:color w:val="1F3864"/>
+                <w:sz w:val="18"/>
+                <w:szCs w:val="18"/>
+              </w:rPr>
+              <w:t>pcs</w:t>
+            </w:r>
+          </w:p>
+        </w:tc>
+        <w:tc>
+          <w:tcPr>
+            <w:tcW w:w="480" w:type="dxa"/>
+            <w:shd w:val="clear" w:color="auto" w:fill="FFFFFF"/>
+            <w:tcMar>
+              <w:top w:w="55" w:type="dxa"/>
+              <w:left w:w="80" w:type="dxa"/>
+              <w:bottom w:w="55" w:type="dxa"/>
+              <w:right w:w="80" w:type="dxa"/>
+            </w:tcMar>
+          </w:tcPr>
+          <w:p>
+            <w:pPr>
+              <w:jc w:val="center"/>
+            </w:pPr>
+            <w:r>
+              <w:rPr>
+                <w:color w:val="1F3864"/>
+                <w:sz w:val="19"/>
+                <w:szCs w:val="19"/>
+              </w:rPr>
+              <w:t>1</w:t>
+            </w:r>
+          </w:p>
+        </w:tc>
+        <w:tc>
+          <w:tcPr>
+            <w:tcW w:w="560" w:type="dxa"/>
+            <w:shd w:val="clear" w:color="auto" w:fill="FFFFFF"/>
+            <w:tcMar>
+              <w:top w:w="55" w:type="dxa"/>
+              <w:left w:w="80" w:type="dxa"/>
+              <w:bottom w:w="55" w:type="dxa"/>
+              <w:right w:w="80" w:type="dxa"/>
+            </w:tcMar>
+          </w:tcPr>
+          <w:p>
+            <w:pPr>
+              <w:jc w:val="center"/>
+            </w:pPr>
+            <w:r>
+              <w:rPr>
+                <w:b/>
+                <w:bCs/>
+                <w:color w:val="2E75B6"/>
+                <w:sz w:val="19"/>
+                <w:szCs w:val="19"/>
+              </w:rPr>
+              <w:t>5</w:t>
+            </w:r>
+          </w:p>
+        </w:tc>
+        <w:tc>
+          <w:tcPr>
+            <w:tcW w:w="700" w:type="dxa"/>
+            <w:shd w:val="clear" w:color="auto" w:fill="FFFFFF"/>
+            <w:tcMar>
+              <w:top w:w="55" w:type="dxa"/>
+              <w:left w:w="80" w:type="dxa"/>
+              <w:bottom w:w="55" w:type="dxa"/>
+              <w:right w:w="80" w:type="dxa"/>
+            </w:tcMar>
+          </w:tcPr>
+          <w:p>
+            <w:pPr>
+              <w:jc w:val="right"/>
+            </w:pPr>
+            <w:r>
+              <w:rPr>
+                <w:color w:val="1F3864"/>
+                <w:sz w:val="18"/>
+                <w:szCs w:val="18"/>
+              </w:rPr>
+              <w:t>₹</w:t>
+            </w:r>
+            <w:r>
+              <w:rPr>
+                <w:color w:val="1F3864"/>
+                <w:sz w:val="18"/>
+                <w:szCs w:val="18"/>
+              </w:rPr>
+              <w:t>20</w:t>
+            </w:r>
+          </w:p>
+        </w:tc>
+        <w:tc>
+          <w:tcPr>
+            <w:tcW w:w="700" w:type="dxa"/>
+            <w:shd w:val="clear" w:color="auto" w:fill="FFFFFF"/>
+            <w:tcMar>
+              <w:top w:w="55" w:type="dxa"/>
+              <w:left w:w="80" w:type="dxa"/>
+              <w:bottom w:w="55" w:type="dxa"/>
+              <w:right w:w="80" w:type="dxa"/>
+            </w:tcMar>
+          </w:tcPr>
+          <w:p>
+            <w:pPr>
+              <w:jc w:val="right"/>
+            </w:pPr>
+            <w:r>
+              <w:rPr>
+                <w:color w:val="1F3864"/>
+                <w:sz w:val="18"/>
+                <w:szCs w:val="18"/>
+              </w:rPr>
+              <w:t>₹150</w:t>
+            </w:r>
+          </w:p>
+        </w:tc>
+        <w:tc>
+          <w:tcPr>
+            <w:tcW w:w="2480" w:type="dxa"/>
+            <w:shd w:val="clear" w:color="auto" w:fill="FFFFFF"/>
+            <w:tcMar>
+              <w:top w:w="55" w:type="dxa"/>
+              <w:left w:w="80" w:type="dxa"/>
+              <w:bottom w:w="55" w:type="dxa"/>
+              <w:right w:w="80" w:type="dxa"/>
+            </w:tcMar>
+          </w:tcPr>
+          <w:p>
+            <w:hyperlink r:id="rId10" w:history="1">
+              <w:r>
+                <w:rPr>
+                  <w:rStyle w:val="Hyperlink"/>
+                  <w:color w:val="2E75B6"/>
+                  <w:sz w:val="18"/>
+                  <w:szCs w:val="18"/>
+                </w:rPr>
+                <w:t>robu.in</w:t>
+              </w:r>
+            </w:hyperlink>
+            <w:r>
+              <w:rPr>
+                <w:color w:val="595959"/>
+                <w:sz w:val="16"/>
+                <w:szCs w:val="16"/>
+              </w:rPr>
+              <w:t xml:space="preserve">  |  </w:t>
+            </w:r>
+            <w:hyperlink r:id="rId11" w:history="1">
+              <w:proofErr w:type="spellStart"/>
+              <w:r>
+                <w:rPr>
+                  <w:rStyle w:val="Hyperlink"/>
+                  <w:color w:val="2E75B6"/>
+                  <w:sz w:val="18"/>
+                  <w:szCs w:val="18"/>
+                </w:rPr>
+                <w:t>Robocraze</w:t>
+              </w:r>
+              <w:proofErr w:type="spellEnd"/>
+            </w:hyperlink>
+          </w:p>
+        </w:tc>
+      </w:tr>
+      <w:tr>
+        <w:tc>
+          <w:tcPr>
+            <w:tcW w:w="320" w:type="dxa"/>
+            <w:shd w:val="clear" w:color="auto" w:fill="EEF3FA"/>
+            <w:tcMar>
+              <w:top w:w="55" w:type="dxa"/>
+              <w:left w:w="80" w:type="dxa"/>
+              <w:bottom w:w="55" w:type="dxa"/>
+              <w:right w:w="80" w:type="dxa"/>
+            </w:tcMar>
+          </w:tcPr>
+          <w:p>
+            <w:pPr>
+              <w:jc w:val="center"/>
+            </w:pPr>
+            <w:r>
+              <w:rPr>
+                <w:color w:val="595959"/>
+                <w:sz w:val="18"/>
+                <w:szCs w:val="18"/>
+              </w:rPr>
+              <w:t>5</w:t>
+            </w:r>
+          </w:p>
+        </w:tc>
+        <w:tc>
+          <w:tcPr>
+            <w:tcW w:w="1800" w:type="dxa"/>
+            <w:shd w:val="clear" w:color="auto" w:fill="EEF3FA"/>
+            <w:tcMar>
+              <w:top w:w="55" w:type="dxa"/>
+              <w:left w:w="80" w:type="dxa"/>
+              <w:bottom w:w="55" w:type="dxa"/>
+              <w:right w:w="80" w:type="dxa"/>
+            </w:tcMar>
+          </w:tcPr>
+          <w:p>
+            <w:r>
+              <w:rPr>
+                <w:b/>
+                <w:bCs/>
+                <w:color w:val="1F3864"/>
+                <w:sz w:val="19"/>
+                <w:szCs w:val="19"/>
+              </w:rPr>
+              <w:t>RGB LED</w:t>
+            </w:r>
+            <w:r>
+              <w:rPr>
+                <w:color w:val="595959"/>
+                <w:sz w:val="16"/>
+                <w:szCs w:val="16"/>
+              </w:rPr>
+              <w:t xml:space="preserve"> 5mm common cathode</w:t>
+            </w:r>
+          </w:p>
+        </w:tc>
+        <w:tc>
+          <w:tcPr>
+            <w:tcW w:w="460" w:type="dxa"/>
+            <w:shd w:val="clear" w:color="auto" w:fill="EEF3FA"/>
+            <w:tcMar>
+              <w:top w:w="55" w:type="dxa"/>
+              <w:left w:w="80" w:type="dxa"/>
+              <w:bottom w:w="55" w:type="dxa"/>
+              <w:right w:w="80" w:type="dxa"/>
+            </w:tcMar>
+          </w:tcPr>
+          <w:p>
+            <w:pPr>
+              <w:jc w:val="center"/>
+            </w:pPr>
+            <w:r>
+              <w:rPr>
+                <w:color w:val="1F3864"/>
+                <w:sz w:val="18"/>
+                <w:szCs w:val="18"/>
+              </w:rPr>
+              <w:t>pcs</w:t>
+            </w:r>
+          </w:p>
+        </w:tc>
+        <w:tc>
+          <w:tcPr>
+            <w:tcW w:w="480" w:type="dxa"/>
+            <w:shd w:val="clear" w:color="auto" w:fill="EEF3FA"/>
+            <w:tcMar>
+              <w:top w:w="55" w:type="dxa"/>
+              <w:left w:w="80" w:type="dxa"/>
+              <w:bottom w:w="55" w:type="dxa"/>
+              <w:right w:w="80" w:type="dxa"/>
+            </w:tcMar>
+          </w:tcPr>
+          <w:p>
+            <w:pPr>
+              <w:jc w:val="center"/>
+            </w:pPr>
+            <w:r>
+              <w:rPr>
+                <w:color w:val="1F3864"/>
+                <w:sz w:val="19"/>
+                <w:szCs w:val="19"/>
+              </w:rPr>
+              <w:t>1</w:t>
+            </w:r>
+          </w:p>
+        </w:tc>
+        <w:tc>
+          <w:tcPr>
+            <w:tcW w:w="560" w:type="dxa"/>
+            <w:shd w:val="clear" w:color="auto" w:fill="EEF3FA"/>
+            <w:tcMar>
+              <w:top w:w="55" w:type="dxa"/>
+              <w:left w:w="80" w:type="dxa"/>
+              <w:bottom w:w="55" w:type="dxa"/>
+              <w:right w:w="80" w:type="dxa"/>
+            </w:tcMar>
+          </w:tcPr>
+          <w:p>
+            <w:pPr>
+              <w:jc w:val="center"/>
+            </w:pPr>
+            <w:r>
+              <w:rPr>
+                <w:b/>
+                <w:bCs/>
+                <w:color w:val="2E75B6"/>
+                <w:sz w:val="19"/>
+                <w:szCs w:val="19"/>
+              </w:rPr>
+              <w:t>5</w:t>
+            </w:r>
+          </w:p>
+        </w:tc>
+        <w:tc>
+          <w:tcPr>
+            <w:tcW w:w="700" w:type="dxa"/>
+            <w:shd w:val="clear" w:color="auto" w:fill="EEF3FA"/>
+            <w:tcMar>
+              <w:top w:w="55" w:type="dxa"/>
+              <w:left w:w="80" w:type="dxa"/>
+              <w:bottom w:w="55" w:type="dxa"/>
+              <w:right w:w="80" w:type="dxa"/>
+            </w:tcMar>
+          </w:tcPr>
+          <w:p>
+            <w:pPr>
+              <w:jc w:val="right"/>
+            </w:pPr>
+            <w:r>
+              <w:rPr>
+                <w:color w:val="1F3864"/>
+                <w:sz w:val="18"/>
+                <w:szCs w:val="18"/>
+              </w:rPr>
+              <w:t>₹10</w:t>
+            </w:r>
+          </w:p>
+        </w:tc>
+        <w:tc>
+          <w:tcPr>
+            <w:tcW w:w="700" w:type="dxa"/>
+            <w:shd w:val="clear" w:color="auto" w:fill="EEF3FA"/>
+            <w:tcMar>
+              <w:top w:w="55" w:type="dxa"/>
+              <w:left w:w="80" w:type="dxa"/>
+              <w:bottom w:w="55" w:type="dxa"/>
+              <w:right w:w="80" w:type="dxa"/>
+            </w:tcMar>
+          </w:tcPr>
+          <w:p>
+            <w:pPr>
+              <w:jc w:val="right"/>
+            </w:pPr>
+            <w:r>
+              <w:rPr>
+                <w:color w:val="1F3864"/>
+                <w:sz w:val="18"/>
+                <w:szCs w:val="18"/>
+              </w:rPr>
+              <w:t>₹50</w:t>
+            </w:r>
+          </w:p>
+        </w:tc>
+        <w:tc>
+          <w:tcPr>
+            <w:tcW w:w="2480" w:type="dxa"/>
+            <w:shd w:val="clear" w:color="auto" w:fill="EEF3FA"/>
+            <w:tcMar>
+              <w:top w:w="55" w:type="dxa"/>
+              <w:left w:w="80" w:type="dxa"/>
+              <w:bottom w:w="55" w:type="dxa"/>
+              <w:right w:w="80" w:type="dxa"/>
+            </w:tcMar>
+          </w:tcPr>
+          <w:p>
+            <w:hyperlink r:id="rId12" w:history="1">
+              <w:r>
+                <w:rPr>
+                  <w:rStyle w:val="Hyperlink"/>
+                  <w:color w:val="2E75B6"/>
+                  <w:sz w:val="18"/>
+                  <w:szCs w:val="18"/>
+                </w:rPr>
+                <w:t>robu.in</w:t>
+              </w:r>
+            </w:hyperlink>
+            <w:r>
+              <w:rPr>
+                <w:color w:val="595959"/>
+                <w:sz w:val="16"/>
+                <w:szCs w:val="16"/>
+              </w:rPr>
+              <w:t xml:space="preserve">  |  </w:t>
+            </w:r>
+            <w:hyperlink r:id="rId13" w:history="1">
+              <w:proofErr w:type="spellStart"/>
+              <w:r>
+                <w:rPr>
+                  <w:rStyle w:val="Hyperlink"/>
+                  <w:color w:val="2E75B6"/>
+                  <w:sz w:val="18"/>
+                  <w:szCs w:val="18"/>
+                </w:rPr>
+                <w:t>Robocraze</w:t>
+              </w:r>
+              <w:proofErr w:type="spellEnd"/>
+            </w:hyperlink>
+          </w:p>
+        </w:tc>
+      </w:tr>
+      <w:tr>
+        <w:tc>
+          <w:tcPr>
+            <w:tcW w:w="320" w:type="dxa"/>
+            <w:shd w:val="clear" w:color="auto" w:fill="FFFFFF"/>
+            <w:tcMar>
+              <w:top w:w="55" w:type="dxa"/>
+              <w:left w:w="80" w:type="dxa"/>
+              <w:bottom w:w="55" w:type="dxa"/>
+              <w:right w:w="80" w:type="dxa"/>
+            </w:tcMar>
+          </w:tcPr>
+          <w:p>
+            <w:pPr>
+              <w:jc w:val="center"/>
+            </w:pPr>
+            <w:r>
+              <w:rPr>
+                <w:color w:val="595959"/>
+                <w:sz w:val="18"/>
+                <w:szCs w:val="18"/>
+              </w:rPr>
+              <w:t>6</w:t>
+            </w:r>
+          </w:p>
+        </w:tc>
+        <w:tc>
+          <w:tcPr>
+            <w:tcW w:w="1800" w:type="dxa"/>
+            <w:shd w:val="clear" w:color="auto" w:fill="FFFFFF"/>
+            <w:tcMar>
+              <w:top w:w="55" w:type="dxa"/>
+              <w:left w:w="80" w:type="dxa"/>
+              <w:bottom w:w="55" w:type="dxa"/>
+              <w:right w:w="80" w:type="dxa"/>
+            </w:tcMar>
+          </w:tcPr>
+          <w:p>
+            <w:pPr>
+              <w:rPr>
+                <w:lang w:val="it-IT"/>
+              </w:rPr>
+            </w:pPr>
+            <w:r>
+              <w:rPr>
+                <w:b/>
+                <w:bCs/>
+                <w:color w:val="1F3864"/>
+                <w:sz w:val="19"/>
+                <w:szCs w:val="19"/>
+                <w:lang w:val="it-IT"/>
+              </w:rPr>
+              <w:t xml:space="preserve">18650 </w:t>
+            </w:r>
+            <w:proofErr w:type="spellStart"/>
+            <w:r>
+              <w:rPr>
+                <w:b/>
+                <w:bCs/>
+                <w:color w:val="1F3864"/>
+                <w:sz w:val="19"/>
+                <w:szCs w:val="19"/>
+                <w:lang w:val="it-IT"/>
+              </w:rPr>
+              <w:t>Li-ion</w:t>
+            </w:r>
+            <w:proofErr w:type="spellEnd"/>
+            <w:r>
+              <w:rPr>
+                <w:b/>
+                <w:bCs/>
+                <w:color w:val="1F3864"/>
+                <w:sz w:val="19"/>
+                <w:szCs w:val="19"/>
+                <w:lang w:val="it-IT"/>
+              </w:rPr>
+              <w:t xml:space="preserve"> Cell</w:t>
+            </w:r>
+            <w:r>
+              <w:rPr>
+                <w:color w:val="595959"/>
+                <w:sz w:val="16"/>
+                <w:szCs w:val="16"/>
+                <w:lang w:val="it-IT"/>
+              </w:rPr>
+              <w:t xml:space="preserve"> 3.7V 3000mAh Samsung/Sony</w:t>
+            </w:r>
+          </w:p>
+        </w:tc>
+        <w:tc>
+          <w:tcPr>
+            <w:tcW w:w="460" w:type="dxa"/>
+            <w:shd w:val="clear" w:color="auto" w:fill="FFFFFF"/>
+            <w:tcMar>
+              <w:top w:w="55" w:type="dxa"/>
+              <w:left w:w="80" w:type="dxa"/>
+              <w:bottom w:w="55" w:type="dxa"/>
+              <w:right w:w="80" w:type="dxa"/>
+            </w:tcMar>
+          </w:tcPr>
+          <w:p>
+            <w:pPr>
+              <w:jc w:val="center"/>
+            </w:pPr>
+            <w:r>
+              <w:rPr>
+                <w:color w:val="1F3864"/>
+                <w:sz w:val="18"/>
+                <w:szCs w:val="18"/>
+              </w:rPr>
+              <w:t>pcs</w:t>
+            </w:r>
+          </w:p>
+        </w:tc>
+        <w:tc>
+          <w:tcPr>
+            <w:tcW w:w="480" w:type="dxa"/>
+            <w:shd w:val="clear" w:color="auto" w:fill="FFFFFF"/>
+            <w:tcMar>
+              <w:top w:w="55" w:type="dxa"/>
+              <w:left w:w="80" w:type="dxa"/>
+              <w:bottom w:w="55" w:type="dxa"/>
+              <w:right w:w="80" w:type="dxa"/>
+            </w:tcMar>
+          </w:tcPr>
+          <w:p>
+            <w:pPr>
+              <w:jc w:val="center"/>
+            </w:pPr>
+            <w:r>
+              <w:rPr>
+                <w:color w:val="1F3864"/>
+                <w:sz w:val="19"/>
+                <w:szCs w:val="19"/>
+              </w:rPr>
+              <w:t>2</w:t>
+            </w:r>
+          </w:p>
+        </w:tc>
+        <w:tc>
+          <w:tcPr>
+            <w:tcW w:w="560" w:type="dxa"/>
+            <w:shd w:val="clear" w:color="auto" w:fill="FFFFFF"/>
+            <w:tcMar>
+              <w:top w:w="55" w:type="dxa"/>
+              <w:left w:w="80" w:type="dxa"/>
+              <w:bottom w:w="55" w:type="dxa"/>
+              <w:right w:w="80" w:type="dxa"/>
+            </w:tcMar>
+          </w:tcPr>
+          <w:p>
+            <w:pPr>
+              <w:jc w:val="center"/>
+            </w:pPr>
+            <w:r>
+              <w:rPr>
+                <w:b/>
+                <w:bCs/>
+                <w:color w:val="2E75B6"/>
+                <w:sz w:val="19"/>
+                <w:szCs w:val="19"/>
+              </w:rPr>
+              <w:t>10</w:t>
+            </w:r>
+          </w:p>
+        </w:tc>
+        <w:tc>
+          <w:tcPr>
+            <w:tcW w:w="700" w:type="dxa"/>
+            <w:shd w:val="clear" w:color="auto" w:fill="FFFFFF"/>
+            <w:tcMar>
+              <w:top w:w="55" w:type="dxa"/>
+              <w:left w:w="80" w:type="dxa"/>
+              <w:bottom w:w="55" w:type="dxa"/>
+              <w:right w:w="80" w:type="dxa"/>
+            </w:tcMar>
+          </w:tcPr>
+          <w:p>
+            <w:pPr>
+              <w:jc w:val="right"/>
+            </w:pPr>
+            <w:r>
+              <w:rPr>
+                <w:color w:val="1F3864"/>
+                <w:sz w:val="18"/>
+                <w:szCs w:val="18"/>
+              </w:rPr>
+              <w:t>₹150</w:t>
+            </w:r>
+          </w:p>
+        </w:tc>
+        <w:tc>
+          <w:tcPr>
+            <w:tcW w:w="700" w:type="dxa"/>
+            <w:shd w:val="clear" w:color="auto" w:fill="FFFFFF"/>
+            <w:tcMar>
+              <w:top w:w="55" w:type="dxa"/>
+              <w:left w:w="80" w:type="dxa"/>
+              <w:bottom w:w="55" w:type="dxa"/>
+              <w:right w:w="80" w:type="dxa"/>
+            </w:tcMar>
+          </w:tcPr>
+          <w:p>
+            <w:pPr>
+              <w:jc w:val="right"/>
+            </w:pPr>
+            <w:r>
+              <w:rPr>
+                <w:color w:val="1F3864"/>
+                <w:sz w:val="18"/>
+                <w:szCs w:val="18"/>
+              </w:rPr>
+              <w:t>₹1,500</w:t>
+            </w:r>
+          </w:p>
+        </w:tc>
+        <w:tc>
+          <w:tcPr>
+            <w:tcW w:w="2480" w:type="dxa"/>
+            <w:shd w:val="clear" w:color="auto" w:fill="FFFFFF"/>
+            <w:tcMar>
+              <w:top w:w="55" w:type="dxa"/>
+              <w:left w:w="80" w:type="dxa"/>
+              <w:bottom w:w="55" w:type="dxa"/>
+              <w:right w:w="80" w:type="dxa"/>
+            </w:tcMar>
+          </w:tcPr>
+          <w:p>
+            <w:hyperlink r:id="rId14" w:history="1">
+              <w:r>
+                <w:rPr>
+                  <w:rStyle w:val="Hyperlink"/>
+                  <w:color w:val="2E75B6"/>
+                  <w:sz w:val="18"/>
+                  <w:szCs w:val="18"/>
+                </w:rPr>
+                <w:t>robu.in</w:t>
+              </w:r>
+            </w:hyperlink>
+            <w:r>
+              <w:rPr>
+                <w:color w:val="595959"/>
+                <w:sz w:val="16"/>
+                <w:szCs w:val="16"/>
+              </w:rPr>
+              <w:t xml:space="preserve">  |  </w:t>
+            </w:r>
             <w:hyperlink r:id="rId15" w:history="1">
               <w:proofErr w:type="spellStart"/>
               <w:r>
@@ -1851,12 +1791,6 @@
         </w:tc>
       </w:tr>
       <w:tr>
-        <w:tblPrEx>
-          <w:tblCellMar>
-            <w:top w:w="0" w:type="dxa"/>
-            <w:bottom w:w="0" w:type="dxa"/>
-          </w:tblCellMar>
-        </w:tblPrEx>
         <w:tc>
           <w:tcPr>
             <w:tcW w:w="320" w:type="dxa"/>
@@ -2061,25 +1995,7 @@
                   <w:sz w:val="18"/>
                   <w:szCs w:val="18"/>
                 </w:rPr>
-                <w:t>robu</w:t>
-              </w:r>
-              <w:r>
-                <w:rPr>
-                  <w:rStyle w:val="Hyperlink"/>
-                  <w:color w:val="2E75B6"/>
-                  <w:sz w:val="18"/>
-                  <w:szCs w:val="18"/>
-                </w:rPr>
-                <w:t>.</w:t>
-              </w:r>
-              <w:r>
-                <w:rPr>
-                  <w:rStyle w:val="Hyperlink"/>
-                  <w:color w:val="2E75B6"/>
-                  <w:sz w:val="18"/>
-                  <w:szCs w:val="18"/>
-                </w:rPr>
-                <w:t>in</w:t>
+                <w:t>robu.in</w:t>
               </w:r>
             </w:hyperlink>
             <w:r>
@@ -2107,12 +2023,6 @@
         </w:tc>
       </w:tr>
       <w:tr>
-        <w:tblPrEx>
-          <w:tblCellMar>
-            <w:top w:w="0" w:type="dxa"/>
-            <w:bottom w:w="0" w:type="dxa"/>
-          </w:tblCellMar>
-        </w:tblPrEx>
         <w:tc>
           <w:tcPr>
             <w:tcW w:w="320" w:type="dxa"/>
@@ -2317,25 +2227,7 @@
                   <w:sz w:val="18"/>
                   <w:szCs w:val="18"/>
                 </w:rPr>
-                <w:t>rob</w:t>
-              </w:r>
-              <w:r>
-                <w:rPr>
-                  <w:rStyle w:val="Hyperlink"/>
-                  <w:color w:val="2E75B6"/>
-                  <w:sz w:val="18"/>
-                  <w:szCs w:val="18"/>
-                </w:rPr>
-                <w:t>u</w:t>
-              </w:r>
-              <w:r>
-                <w:rPr>
-                  <w:rStyle w:val="Hyperlink"/>
-                  <w:color w:val="2E75B6"/>
-                  <w:sz w:val="18"/>
-                  <w:szCs w:val="18"/>
-                </w:rPr>
-                <w:t>.in</w:t>
+                <w:t>robu.in</w:t>
               </w:r>
             </w:hyperlink>
             <w:r>
@@ -2363,12 +2255,6 @@
         </w:tc>
       </w:tr>
       <w:tr>
-        <w:tblPrEx>
-          <w:tblCellMar>
-            <w:top w:w="0" w:type="dxa"/>
-            <w:bottom w:w="0" w:type="dxa"/>
-          </w:tblCellMar>
-        </w:tblPrEx>
         <w:tc>
           <w:tcPr>
             <w:tcW w:w="320" w:type="dxa"/>
@@ -2568,12 +2454,6 @@
         </w:tc>
       </w:tr>
       <w:tr>
-        <w:tblPrEx>
-          <w:tblCellMar>
-            <w:top w:w="0" w:type="dxa"/>
-            <w:bottom w:w="0" w:type="dxa"/>
-          </w:tblCellMar>
-        </w:tblPrEx>
         <w:tc>
           <w:tcPr>
             <w:tcW w:w="320" w:type="dxa"/>
@@ -2778,25 +2658,7 @@
                   <w:sz w:val="18"/>
                   <w:szCs w:val="18"/>
                 </w:rPr>
-                <w:t>ro</w:t>
-              </w:r>
-              <w:r>
-                <w:rPr>
-                  <w:rStyle w:val="Hyperlink"/>
-                  <w:color w:val="2E75B6"/>
-                  <w:sz w:val="18"/>
-                  <w:szCs w:val="18"/>
-                </w:rPr>
-                <w:t>b</w:t>
-              </w:r>
-              <w:r>
-                <w:rPr>
-                  <w:rStyle w:val="Hyperlink"/>
-                  <w:color w:val="2E75B6"/>
-                  <w:sz w:val="18"/>
-                  <w:szCs w:val="18"/>
-                </w:rPr>
-                <w:t>u.in</w:t>
+                <w:t>robu.in</w:t>
               </w:r>
             </w:hyperlink>
             <w:r>
@@ -2824,12 +2686,6 @@
         </w:tc>
       </w:tr>
       <w:tr>
-        <w:tblPrEx>
-          <w:tblCellMar>
-            <w:top w:w="0" w:type="dxa"/>
-            <w:bottom w:w="0" w:type="dxa"/>
-          </w:tblCellMar>
-        </w:tblPrEx>
         <w:tc>
           <w:tcPr>
             <w:tcW w:w="320" w:type="dxa"/>
@@ -3029,12 +2885,6 @@
         </w:tc>
       </w:tr>
       <w:tr>
-        <w:tblPrEx>
-          <w:tblCellMar>
-            <w:top w:w="0" w:type="dxa"/>
-            <w:bottom w:w="0" w:type="dxa"/>
-          </w:tblCellMar>
-        </w:tblPrEx>
         <w:tc>
           <w:tcPr>
             <w:tcW w:w="320" w:type="dxa"/>
@@ -3234,12 +3084,6 @@
         </w:tc>
       </w:tr>
       <w:tr>
-        <w:tblPrEx>
-          <w:tblCellMar>
-            <w:top w:w="0" w:type="dxa"/>
-            <w:bottom w:w="0" w:type="dxa"/>
-          </w:tblCellMar>
-        </w:tblPrEx>
         <w:tc>
           <w:tcPr>
             <w:tcW w:w="320" w:type="dxa"/>
@@ -3444,25 +3288,7 @@
                   <w:sz w:val="18"/>
                   <w:szCs w:val="18"/>
                 </w:rPr>
-                <w:t>robu</w:t>
-              </w:r>
-              <w:r>
-                <w:rPr>
-                  <w:rStyle w:val="Hyperlink"/>
-                  <w:color w:val="2E75B6"/>
-                  <w:sz w:val="18"/>
-                  <w:szCs w:val="18"/>
-                </w:rPr>
-                <w:t>.</w:t>
-              </w:r>
-              <w:r>
-                <w:rPr>
-                  <w:rStyle w:val="Hyperlink"/>
-                  <w:color w:val="2E75B6"/>
-                  <w:sz w:val="18"/>
-                  <w:szCs w:val="18"/>
-                </w:rPr>
-                <w:t>in</w:t>
+                <w:t>robu.in</w:t>
               </w:r>
             </w:hyperlink>
             <w:r>
@@ -3490,12 +3316,6 @@
         </w:tc>
       </w:tr>
       <w:tr>
-        <w:tblPrEx>
-          <w:tblCellMar>
-            <w:top w:w="0" w:type="dxa"/>
-            <w:bottom w:w="0" w:type="dxa"/>
-          </w:tblCellMar>
-        </w:tblPrEx>
         <w:tc>
           <w:tcPr>
             <w:tcW w:w="320" w:type="dxa"/>
@@ -3695,12 +3515,6 @@
         </w:tc>
       </w:tr>
       <w:tr>
-        <w:tblPrEx>
-          <w:tblCellMar>
-            <w:top w:w="0" w:type="dxa"/>
-            <w:bottom w:w="0" w:type="dxa"/>
-          </w:tblCellMar>
-        </w:tblPrEx>
         <w:tc>
           <w:tcPr>
             <w:tcW w:w="320" w:type="dxa"/>
@@ -3900,12 +3714,6 @@
         </w:tc>
       </w:tr>
       <w:tr>
-        <w:tblPrEx>
-          <w:tblCellMar>
-            <w:top w:w="0" w:type="dxa"/>
-            <w:bottom w:w="0" w:type="dxa"/>
-          </w:tblCellMar>
-        </w:tblPrEx>
         <w:tc>
           <w:tcPr>
             <w:tcW w:w="320" w:type="dxa"/>
@@ -4195,12 +4003,6 @@
         </w:tc>
       </w:tr>
       <w:tr>
-        <w:tblPrEx>
-          <w:tblCellMar>
-            <w:top w:w="0" w:type="dxa"/>
-            <w:bottom w:w="0" w:type="dxa"/>
-          </w:tblCellMar>
-        </w:tblPrEx>
         <w:trPr>
           <w:gridAfter w:val="5"/>
           <w:wAfter w:w="500" w:type="dxa"/>
@@ -4269,12 +4071,6 @@
         </w:tc>
       </w:tr>
       <w:tr>
-        <w:tblPrEx>
-          <w:tblCellMar>
-            <w:top w:w="0" w:type="dxa"/>
-            <w:bottom w:w="0" w:type="dxa"/>
-          </w:tblCellMar>
-        </w:tblPrEx>
         <w:trPr>
           <w:gridAfter w:val="5"/>
           <w:wAfter w:w="500" w:type="dxa"/>

</xml_diff>